<commit_message>
[Classification] Update classification methods documentation and enhance notebook with model building steps
</commit_message>
<xml_diff>
--- a/4-Classification/1-Introduction/Exploring Classification methods.docx
+++ b/4-Classification/1-Introduction/Exploring Classification methods.docx
@@ -157,11 +157,9 @@
             <w:hideMark/>
           </w:tcPr>
           <w:p>
-            <w:proofErr w:type="spellStart"/>
             <w:r>
               <w:t>LogisticRegression</w:t>
             </w:r>
-            <w:proofErr w:type="spellEnd"/>
           </w:p>
         </w:tc>
         <w:tc>
@@ -213,6 +211,12 @@
             <w:hideMark/>
           </w:tcPr>
           <w:p>
+            <w:pPr>
+              <w:rPr>
+                <w:b/>
+                <w:bCs/>
+              </w:rPr>
+            </w:pPr>
             <w:r>
               <w:t>Encoded categorical features (e.g., Variety, Origin</w:t>
             </w:r>
@@ -222,52 +226,27 @@
             <w:r>
               <w:t xml:space="preserve"> as </w:t>
             </w:r>
-            <w:proofErr w:type="spellStart"/>
             <w:r>
               <w:t>OneHotEnconder</w:t>
             </w:r>
-            <w:proofErr w:type="spellEnd"/>
             <w:r>
               <w:t>)</w:t>
             </w:r>
             <w:r>
-              <w:t xml:space="preserve">, encoded ordinal </w:t>
-            </w:r>
-            <w:proofErr w:type="gramStart"/>
-            <w:r>
-              <w:t>features(</w:t>
-            </w:r>
-            <w:proofErr w:type="gramEnd"/>
-            <w:r>
-              <w:t xml:space="preserve">e.g., Item Size as </w:t>
-            </w:r>
-            <w:proofErr w:type="spellStart"/>
+              <w:t xml:space="preserve">, encoded ordinal features(e.g., Item Size as </w:t>
+            </w:r>
             <w:r>
               <w:t>OrdinalEncoder</w:t>
             </w:r>
-            <w:proofErr w:type="spellEnd"/>
             <w:r>
               <w:t>)</w:t>
             </w:r>
             <w:r>
-              <w:t xml:space="preserve"> and scaled </w:t>
-            </w:r>
-            <w:proofErr w:type="spellStart"/>
-            <w:r>
-              <w:t>numericals</w:t>
-            </w:r>
-            <w:proofErr w:type="spellEnd"/>
-            <w:r>
-              <w:t xml:space="preserve"> (Weight, Price) are inputs; binary target</w:t>
-            </w:r>
-            <w:r>
-              <w:t xml:space="preserve"> were encoded using </w:t>
-            </w:r>
-            <w:proofErr w:type="spellStart"/>
-            <w:r>
-              <w:t>LabelEconder</w:t>
-            </w:r>
-            <w:proofErr w:type="spellEnd"/>
+              <w:t xml:space="preserve"> and scaled numericals (Weight, Price) are inputs; binary target</w:t>
+            </w:r>
+            <w:r>
+              <w:t xml:space="preserve"> were encoded using LabelEconder</w:t>
+            </w:r>
             <w:r>
               <w:t xml:space="preserve"> (Orange=1, White=0) fits logistic output. Preprocessing: </w:t>
             </w:r>
@@ -288,11 +267,9 @@
             <w:hideMark/>
           </w:tcPr>
           <w:p>
-            <w:proofErr w:type="spellStart"/>
             <w:r>
               <w:t>DecisionTreeClassifier</w:t>
             </w:r>
-            <w:proofErr w:type="spellEnd"/>
           </w:p>
         </w:tc>
         <w:tc>
@@ -355,11 +332,9 @@
             <w:hideMark/>
           </w:tcPr>
           <w:p>
-            <w:proofErr w:type="spellStart"/>
             <w:r>
               <w:t>RandomForestClassifier</w:t>
             </w:r>
-            <w:proofErr w:type="spellEnd"/>
           </w:p>
         </w:tc>
         <w:tc>
@@ -406,15 +381,7 @@
           </w:tcPr>
           <w:p>
             <w:r>
-              <w:t xml:space="preserve">Trees ensemble on bootstrapped samples, voting on Color; feature importance on Variety/Origin. Robust to </w:t>
-            </w:r>
-            <w:proofErr w:type="spellStart"/>
-            <w:r>
-              <w:t>categoricals</w:t>
-            </w:r>
-            <w:proofErr w:type="spellEnd"/>
-            <w:r>
-              <w:t xml:space="preserve"> after encoding, no scaling. Handles imbalance (Orange majority); ~92% accuracy by reducing variance.</w:t>
+              <w:t>Trees ensemble on bootstrapped samples, voting on Color; feature importance on Variety/Origin. Robust to categoricals after encoding, no scaling. Handles imbalance (Orange majority); ~92% accuracy by reducing variance.</w:t>
             </w:r>
           </w:p>
         </w:tc>
@@ -496,11 +463,9 @@
             <w:hideMark/>
           </w:tcPr>
           <w:p>
-            <w:proofErr w:type="spellStart"/>
             <w:r>
               <w:t>KNeighborsClassifier</w:t>
             </w:r>
-            <w:proofErr w:type="spellEnd"/>
           </w:p>
         </w:tc>
         <w:tc>
@@ -547,15 +512,13 @@
           </w:tcPr>
           <w:p>
             <w:r>
-              <w:t xml:space="preserve">Neighbors (k=5) vote based on distance in scaled space (Price, Weight) and encoded features; predicts Color for new pumpkins. Impute </w:t>
-            </w:r>
-            <w:proofErr w:type="spellStart"/>
-            <w:r>
-              <w:t>missings</w:t>
-            </w:r>
-            <w:proofErr w:type="spellEnd"/>
-            <w:r>
-              <w:t>; good for clusters by origin; ~88% accuracy but slow.</w:t>
+              <w:t>Neighbors (k=5) vote based on distance in scaled space (Price, Weight) and encoded features; predicts Color for new pumpkins.</w:t>
+            </w:r>
+            <w:r>
+              <w:t xml:space="preserve"> Dropped rows with missing values</w:t>
+            </w:r>
+            <w:r>
+              <w:t>; ~88% accuracy but slow.</w:t>
             </w:r>
           </w:p>
         </w:tc>

</xml_diff>